<commit_message>
Speech.docx con las seis frases aclaradas; copia del original
Co-Authored-By: Claude Sonnet 5.5 <noreply@anthropic.com>
</commit_message>
<xml_diff>
--- a/docs/Speech.docx
+++ b/docs/Speech.docx
@@ -24,17 +24,17 @@
     </w:p>
     <w:p>
       <w:r>
-        <w:t>"Esto lo ha dibujado mi hija Martina, cinco años. Es nuestra casa nueva: tiene un cole al lado, un columpio y aquí, con el bastón, los abuelos. </w:t>
-      </w:r>
-      <w:r>
-        <w:rPr>
-          <w:i/>
-          <w:iCs/>
-        </w:rPr>
-        <w:t>(pausa)</w:t>
-      </w:r>
-      <w:r>
-        <w:t> Solo tiene un problema: no sabemos dónde está esa casa." "Somos mi marido, Martina, yo, el bebé que viene en septiembre —que ya tiene más ropa que yo— y mis padres, que quieren venirse cerca. Mi madre ha sido clara: a una residencia, ni muerta; a un centro de día, a jugar al dominó, sí."</w:t>
+        <w:t xml:space="preserve">"Esto lo ha dibujado mi hija Martina, cinco años. Es nuestra casa nueva: tiene un cole al lado, un columpio y aquí, con el bastón, los abuelos. </w:t>
+      </w:r>
+      <w:r>
+        <w:rPr>
+          <w:i/>
+          <w:iCs/>
+        </w:rPr>
+        <w:t xml:space="preserve">(pausa)</w:t>
+      </w:r>
+      <w:r>
+        <w:t xml:space="preserve"> Solo tiene un problema: no sabemos dónde está esa casa." "Somos mi marido, Martina, yo, el bebé que viene en septiembre —que ya tiene más ropa que yo— y mis padres, que quieren venirse cerca, pero con condiciones: mi madre quiere un hogar de mayores para jugar al dominó con sus amigas, y mi padre, que anda regular, un centro de día por las mañanas. Y los dos lo tienen claro: a una residencia, todavía no."</w:t>
       </w:r>
     </w:p>
     <w:p/>
@@ -293,17 +293,17 @@
         </w:rPr>
       </w:pPr>
       <w:r>
-        <w:t>"Tres finalistas. Mi cuñado, que siempre opina, dice que Tres Cantos es de otro nivel. Y tiene razón: </w:t>
-      </w:r>
-      <w:r>
-        <w:rPr>
-          <w:b/>
-          <w:bCs/>
-        </w:rPr>
-        <w:t>30.280 € de renta por habitante, frente a 19.413 en Getafe</w:t>
-      </w:r>
-      <w:r>
-        <w:t>. Su razón, sí; mi cuenta corriente, no."</w:t>
+        <w:t xml:space="preserve">"Tres finalistas. Mi cuñado, que siempre opina, dice: 'Tres Cantos es muchísimo mejor'. En renta tiene razón: </w:t>
+      </w:r>
+      <w:r>
+        <w:rPr>
+          <w:b/>
+          <w:bCs/>
+        </w:rPr>
+        <w:t xml:space="preserve">30.280 € por habitante, frente a 19.413 en Getafe</w:t>
+      </w:r>
+      <w:r>
+        <w:t xml:space="preserve">. Pero yo no busco el sitio más rico: busco el que tenga lo que necesita mi familia."</w:t>
       </w:r>
       <w:r>
         <w:rPr>
@@ -354,37 +354,37 @@
     </w:p>
     <w:p>
       <w:r>
-        <w:t>"Tres Cantos: 54.000 vecinos con cinco escuelas infantiles públicas y dos centros de salud. Alcalá: el hospital a dos kilómetros. Getafe: Metro 3, Metro 12 y dos Cercanías, abono B1… y, ojo, </w:t>
-      </w:r>
-      <w:r>
-        <w:rPr>
-          <w:b/>
-          <w:bCs/>
-        </w:rPr>
-        <w:t>2,2 plazas de residencia por cada 100 mayores</w:t>
-      </w:r>
-      <w:r>
-        <w:t>: la mitad que la media de la Comunidad. </w:t>
-      </w:r>
-      <w:r>
-        <w:rPr>
-          <w:i/>
-          <w:iCs/>
-        </w:rPr>
-        <w:t>(guiño al público)</w:t>
-      </w:r>
-      <w:r>
-        <w:t> Me lo apunto: mis padres, centro de día sí; residencia, ya veremos." "Mi padre vota Metro, mi madre vota Alcalá por la Plaza de Cervantes, y Martina vota columpios. </w:t>
-      </w:r>
-      <w:r>
-        <w:rPr>
-          <w:b/>
-          <w:bCs/>
-        </w:rPr>
-        <w:t>Gana Getafe, dos a uno</w:t>
-      </w:r>
-      <w:r>
-        <w:t> (Martina se abstiene)."</w:t>
+        <w:t xml:space="preserve">"Tres Cantos: 54.000 vecinos con cinco escuelas infantiles públicas y dos centros de salud. Alcalá: el hospital a dos kilómetros. Getafe: Metro 3, Metro 12 y dos Cercanías, abono B1… y, ojo, </w:t>
+      </w:r>
+      <w:r>
+        <w:rPr>
+          <w:b/>
+          <w:bCs/>
+        </w:rPr>
+        <w:t xml:space="preserve">2,2 plazas de residencia por cada 100 mayores</w:t>
+      </w:r>
+      <w:r>
+        <w:t xml:space="preserve">: la mitad que la media de la Comunidad. </w:t>
+      </w:r>
+      <w:r>
+        <w:rPr>
+          <w:i/>
+          <w:iCs/>
+        </w:rPr>
+        <w:t xml:space="preserve">(guiño al público)</w:t>
+      </w:r>
+      <w:r>
+        <w:t xml:space="preserve"> Me lo apunto: para mis padres, centro de día sí; residencia, más adelante." "Elegimos Getafe: Metro y 21 autobuses a Madrid para mi marido, 15 escuelas infantiles públicas para el bebé y centros de día para mi padre. Tres Cantos tiene solo dos centros de salud para 54.000 vecinos, y Alcalá, solo 6 autobuses directos a Madrid.</w:t>
+      </w:r>
+      <w:r>
+        <w:rPr>
+          <w:b/>
+          <w:bCs/>
+        </w:rPr>
+        <w:t xml:space="preserve"/>
+      </w:r>
+      <w:r>
+        <w:t xml:space="preserve">"</w:t>
       </w:r>
     </w:p>
     <w:p/>
@@ -455,6 +455,66 @@
         <w:rPr>
           <w:color w:val="156082" w:themeColor="accent1"/>
         </w:rPr>
+        <w:t xml:space="preserve">SALE</w:t>
+      </w:r>
+      <w:r>
+        <w:t xml:space="preserve">: </w:t>
+      </w:r>
+      <w:r>
+        <w:rPr>
+          <w:b/>
+          <w:bCs/>
+        </w:rPr>
+        <w:t xml:space="preserve">5 de 6</w:t>
+      </w:r>
+      <w:r>
+        <w:t xml:space="preserve"> a menos de 10 min: 2 escuelas infantiles públicas, 6 colegios, centro de salud y centro de día. Solo falta el hogar de mayores: </w:t>
+      </w:r>
+      <w:r>
+        <w:rPr>
+          <w:i/>
+          <w:iCs/>
+        </w:rPr>
+        <w:t xml:space="preserve">"centro de día para mi padre, sí; para el dominó de mi madre, falta un hogar de mayores cerca"</w:t>
+      </w:r>
+    </w:p>
+    <w:p>
+      <w:r>
+        <w:rPr>
+          <w:color w:val="EE0000"/>
+        </w:rPr>
+        <w:t>PULSAR</w:t>
+      </w:r>
+      <w:r>
+        <w:t xml:space="preserve">: </w:t>
+      </w:r>
+      <w:r>
+        <w:rPr>
+          <w:b/>
+          <w:bCs/>
+        </w:rPr>
+        <w:t>Los Molinos </w:t>
+      </w:r>
+      <w:r>
+        <w:t>(tarjeta del barrio)</w:t>
+      </w:r>
+    </w:p>
+    <w:p>
+      <w:r>
+        <w:t>"Y me enseñan uno nuevo, el de los anuncios: 11.473 vecinos, todo recién estrenado."</w:t>
+      </w:r>
+    </w:p>
+    <w:p>
+      <w:pPr>
+        <w:rPr>
+          <w:i/>
+          <w:iCs/>
+        </w:rPr>
+      </w:pPr>
+      <w:r>
+        <w:rPr>
+          <w:color w:val="156082" w:themeColor="accent1"/>
+        </w:rPr>
         <w:t>SALE</w:t>
       </w:r>
       <w:r>
@@ -465,129 +525,69 @@
           <w:b/>
           <w:bCs/>
         </w:rPr>
+        <w:t>2 de 6</w:t>
+      </w:r>
+      <w:r>
+        <w:t>: ni escuela infantil pública, ni centro de salud, ni centro de día. </w:t>
+      </w:r>
+      <w:r>
+        <w:rPr>
+          <w:i/>
+          <w:iCs/>
+        </w:rPr>
+        <w:t>"Muy bonito, muy nuevo… y sin servicios. Como mi primer piso."</w:t>
+      </w:r>
+    </w:p>
+    <w:p>
+      <w:r>
+        <w:rPr>
+          <w:color w:val="EE0000"/>
+        </w:rPr>
+        <w:t>PULSAR</w:t>
+      </w:r>
+      <w:r>
+        <w:t xml:space="preserve">: </w:t>
+      </w:r>
+      <w:r>
+        <w:rPr>
+          <w:b/>
+          <w:bCs/>
+        </w:rPr>
+        <w:t>El Rosón</w:t>
+      </w:r>
+      <w:r>
+        <w:t> (en construcción)</w:t>
+      </w:r>
+    </w:p>
+    <w:p>
+      <w:r>
+        <w:t>"Y este se está construyendo todavía."</w:t>
+      </w:r>
+    </w:p>
+    <w:p>
+      <w:pPr>
+        <w:rPr>
+          <w:b/>
+          <w:bCs/>
+        </w:rPr>
+      </w:pPr>
+      <w:r>
+        <w:rPr>
+          <w:color w:val="156082" w:themeColor="accent1"/>
+        </w:rPr>
+        <w:t>SALE</w:t>
+      </w:r>
+      <w:r>
+        <w:t xml:space="preserve">: </w:t>
+      </w:r>
+      <w:r>
+        <w:rPr>
+          <w:b/>
+          <w:bCs/>
+        </w:rPr>
         <w:t>5 de 6</w:t>
       </w:r>
       <w:r>
-        <w:t> a menos de 10 min: 2 escuelas infantiles públicas, 6 colegios, centro de salud y centro de día. Falta el hogar de mayores: </w:t>
-      </w:r>
-      <w:r>
-        <w:rPr>
-          <w:i/>
-          <w:iCs/>
-        </w:rPr>
-        <w:t>"y mi padre sin dominó"</w:t>
-      </w:r>
-    </w:p>
-    <w:p>
-      <w:r>
-        <w:rPr>
-          <w:color w:val="EE0000"/>
-        </w:rPr>
-        <w:t>PULSAR</w:t>
-      </w:r>
-      <w:r>
-        <w:t xml:space="preserve">: </w:t>
-      </w:r>
-      <w:r>
-        <w:rPr>
-          <w:b/>
-          <w:bCs/>
-        </w:rPr>
-        <w:t>Los Molinos </w:t>
-      </w:r>
-      <w:r>
-        <w:t>(tarjeta del barrio)</w:t>
-      </w:r>
-    </w:p>
-    <w:p>
-      <w:r>
-        <w:t>"Y me enseñan uno nuevo, el de los anuncios: 11.473 vecinos, todo recién estrenado."</w:t>
-      </w:r>
-    </w:p>
-    <w:p>
-      <w:pPr>
-        <w:rPr>
-          <w:i/>
-          <w:iCs/>
-        </w:rPr>
-      </w:pPr>
-      <w:r>
-        <w:rPr>
-          <w:color w:val="156082" w:themeColor="accent1"/>
-        </w:rPr>
-        <w:t>SALE</w:t>
-      </w:r>
-      <w:r>
-        <w:t xml:space="preserve">: </w:t>
-      </w:r>
-      <w:r>
-        <w:rPr>
-          <w:b/>
-          <w:bCs/>
-        </w:rPr>
-        <w:t>2 de 6</w:t>
-      </w:r>
-      <w:r>
-        <w:t>: ni escuela infantil pública, ni centro de salud, ni centro de día. </w:t>
-      </w:r>
-      <w:r>
-        <w:rPr>
-          <w:i/>
-          <w:iCs/>
-        </w:rPr>
-        <w:t>"Muy bonito, muy nuevo… y sin servicios. Como mi primer piso."</w:t>
-      </w:r>
-    </w:p>
-    <w:p>
-      <w:r>
-        <w:rPr>
-          <w:color w:val="EE0000"/>
-        </w:rPr>
-        <w:t>PULSAR</w:t>
-      </w:r>
-      <w:r>
-        <w:t xml:space="preserve">: </w:t>
-      </w:r>
-      <w:r>
-        <w:rPr>
-          <w:b/>
-          <w:bCs/>
-        </w:rPr>
-        <w:t>El Rosón</w:t>
-      </w:r>
-      <w:r>
-        <w:t> (en construcción)</w:t>
-      </w:r>
-    </w:p>
-    <w:p>
-      <w:r>
-        <w:t>"Y este se está construyendo todavía."</w:t>
-      </w:r>
-    </w:p>
-    <w:p>
-      <w:pPr>
-        <w:rPr>
-          <w:b/>
-          <w:bCs/>
-        </w:rPr>
-      </w:pPr>
-      <w:r>
-        <w:rPr>
-          <w:color w:val="156082" w:themeColor="accent1"/>
-        </w:rPr>
-        <w:t>SALE</w:t>
-      </w:r>
-      <w:r>
-        <w:t xml:space="preserve">: </w:t>
-      </w:r>
-      <w:r>
-        <w:rPr>
-          <w:b/>
-          <w:bCs/>
-        </w:rPr>
-        <w:t>5 de 6</w:t>
-      </w:r>
-      <w:r>
         <w:t> hoy. 2.752 viviendas previstas: cuando esté completo, </w:t>
       </w:r>
       <w:r>
@@ -601,37 +601,37 @@
     <w:p>
       <w:r>
         <w:lastRenderedPageBreak/>
-        <w:t>"En El Rosón todavía no ha llegado todo el mundo. Es decir, </w:t>
-      </w:r>
-      <w:r>
-        <w:rPr>
-          <w:b/>
-          <w:bCs/>
-        </w:rPr>
-        <w:t>llegamos antes que los demás</w:t>
-      </w:r>
-      <w:r>
-        <w:t>. Dicen que cuando lleguen todos, el barrio se revaloriza. Cuna y Canas no predice precios: </w:t>
-      </w:r>
-      <w:r>
-        <w:rPr>
-          <w:b/>
-          <w:bCs/>
-        </w:rPr>
-        <w:t>predice colegios</w:t>
-      </w:r>
-      <w:r>
-        <w:t>. </w:t>
-      </w:r>
-      <w:r>
-        <w:rPr>
-          <w:i/>
-          <w:iCs/>
-        </w:rPr>
-        <w:t>(pausa)</w:t>
-      </w:r>
-      <w:r>
-        <w:t> Mi cuñado ya lo ha apuntado igualmente."</w:t>
+        <w:t xml:space="preserve">"En El Rosón todavía no ha llegado todo el mundo: llegamos antes que los demás, y ya tiene casi todo lo que buscamos. ¿Se va a revalorizar el barrio? No lo sé: Cuna y Canas no usa precios de pisos. Lo que sí sé es qué va a hacer falta cuando llegue esa gente: colegios, centros de salud…</w:t>
+      </w:r>
+      <w:r>
+        <w:rPr>
+          <w:b/>
+          <w:bCs/>
+        </w:rPr>
+        <w:t xml:space="preserve"/>
+      </w:r>
+      <w:r>
+        <w:t xml:space="preserve"/>
+      </w:r>
+      <w:r>
+        <w:rPr>
+          <w:b/>
+          <w:bCs/>
+        </w:rPr>
+        <w:t xml:space="preserve"/>
+      </w:r>
+      <w:r>
+        <w:t xml:space="preserve"/>
+      </w:r>
+      <w:r>
+        <w:rPr>
+          <w:i/>
+          <w:iCs/>
+        </w:rPr>
+        <w:t xml:space="preserve"/>
+      </w:r>
+      <w:r>
+        <w:t xml:space="preserve">"</w:t>
       </w:r>
     </w:p>
     <w:p/>
@@ -744,36 +744,36 @@
           <w:b/>
           <w:bCs/>
         </w:rPr>
-        <w:t>Centro de día</w:t>
-      </w:r>
-      <w:r>
-        <w:t> </w:t>
-      </w:r>
-      <w:r>
-        <w:rPr>
-          <w:i/>
-          <w:iCs/>
-        </w:rPr>
-        <w:t>(aquí, despacio)</w:t>
-      </w:r>
-      <w:r>
-        <w:t>: </w:t>
-      </w:r>
-      <w:r>
-        <w:rPr>
-          <w:i/>
-          <w:iCs/>
-        </w:rPr>
-        <w:t>"harían falta </w:t>
-      </w:r>
-      <w:r>
-        <w:rPr>
-          <w:b/>
-          <w:bCs/>
-          <w:i/>
-          <w:iCs/>
-        </w:rPr>
-        <w:t>4 nuevos, los cuatro ya hoy</w:t>
+        <w:t xml:space="preserve">Centro de día</w:t>
+      </w:r>
+      <w:r>
+        <w:t xml:space="preserve"> </w:t>
+      </w:r>
+      <w:r>
+        <w:rPr>
+          <w:i/>
+          <w:iCs/>
+        </w:rPr>
+        <w:t xml:space="preserve">(aquí, despacio)</w:t>
+      </w:r>
+      <w:r>
+        <w:t xml:space="preserve">: </w:t>
+      </w:r>
+      <w:r>
+        <w:rPr>
+          <w:i/>
+          <w:iCs/>
+        </w:rPr>
+        <w:t xml:space="preserve">"harían falta </w:t>
+      </w:r>
+      <w:r>
+        <w:rPr>
+          <w:b/>
+          <w:bCs/>
+          <w:i/>
+          <w:iCs/>
+        </w:rPr>
+        <w:t xml:space="preserve">4 nuevos, los cuatro ya hoy</w:t>
       </w:r>
       <w:r>
         <w:rPr>
@@ -788,7 +788,7 @@
           <w:i/>
           <w:iCs/>
         </w:rPr>
-        <w:t>Kelvinator</w:t>
+        <w:t xml:space="preserve">Kelvinator</w:t>
       </w:r>
       <w:proofErr w:type="spellEnd"/>
       <w:r>
@@ -796,23 +796,23 @@
           <w:i/>
           <w:iCs/>
         </w:rPr>
-        <w:t>. </w:t>
-      </w:r>
-      <w:r>
-        <w:rPr>
-          <w:b/>
-          <w:bCs/>
-          <w:i/>
-          <w:iCs/>
-        </w:rPr>
-        <w:t>¡Mis padres!</w:t>
-      </w:r>
-      <w:r>
-        <w:rPr>
-          <w:i/>
-          <w:iCs/>
-        </w:rPr>
-        <w:t> Llegamos antes que ellos."</w:t>
+        <w:t xml:space="preserve">. </w:t>
+      </w:r>
+      <w:r>
+        <w:rPr>
+          <w:b/>
+          <w:bCs/>
+          <w:i/>
+          <w:iCs/>
+        </w:rPr>
+        <w:t xml:space="preserve">¡Mi padre! Llegamos antes que él.</w:t>
+      </w:r>
+      <w:r>
+        <w:rPr>
+          <w:i/>
+          <w:iCs/>
+        </w:rPr>
+        <w:t xml:space="preserve">"</w:t>
       </w:r>
     </w:p>
     <w:p>
@@ -978,14 +978,14 @@
         </w:rPr>
       </w:pPr>
       <w:r>
-        <w:t>Leer la frase de arriba. Señalar los círculos grises: </w:t>
-      </w:r>
-      <w:r>
-        <w:rPr>
-          <w:i/>
-          <w:iCs/>
-        </w:rPr>
-        <w:t>"cada uno es una sección censal con sus niños de 3 a 11 años, por el 85 % que va a un colegio: esa es la demanda."</w:t>
+        <w:t xml:space="preserve">Leer la frase de arriba. Señalar los círculos grises: </w:t>
+      </w:r>
+      <w:r>
+        <w:rPr>
+          <w:i/>
+          <w:iCs/>
+        </w:rPr>
+        <w:t xml:space="preserve">"cada círculo es una zona de unos 2.000 vecinos; cuanto más grande, más niños en edad de cole viven allí. Esa es la demanda: dónde están los niños que necesitan plaza."</w:t>
       </w:r>
     </w:p>
     <w:p>
@@ -1225,17 +1225,17 @@
     </w:p>
     <w:p>
       <w:r>
-        <w:t>"Y lo de los padres de Laura: Getafe tiene 2,2 plazas por cada 100 mayores; la media de la Comunidad, 4,3. </w:t>
-      </w:r>
-      <w:r>
-        <w:rPr>
-          <w:b/>
-          <w:bCs/>
-        </w:rPr>
-        <w:t>Faltan unas 770 plazas.</w:t>
-      </w:r>
-      <w:r>
-        <w:t>"</w:t>
+        <w:t xml:space="preserve">"Y lo de los padres de Laura, aunque no la necesiten hoy: Getafe tiene 2,2 plazas de residencia por cada 100 mayores, y la media de la Comunidad es 4,3. Faltan unas 780 plazas. El Ayuntamiento tiene que planificarlo ya.</w:t>
+      </w:r>
+      <w:r>
+        <w:rPr>
+          <w:b/>
+          <w:bCs/>
+        </w:rPr>
+        <w:t xml:space="preserve"/>
+      </w:r>
+      <w:r>
+        <w:t xml:space="preserve">"</w:t>
       </w:r>
     </w:p>
     <w:p>
@@ -1243,20 +1243,20 @@
         <w:rPr>
           <w:color w:val="156082" w:themeColor="accent1"/>
         </w:rPr>
-        <w:t>SALE</w:t>
+        <w:t xml:space="preserve">SALE</w:t>
       </w:r>
       <w:r>
         <w:t xml:space="preserve">: </w:t>
       </w:r>
       <w:r>
-        <w:t>Titular: </w:t>
-      </w:r>
-      <w:r>
-        <w:rPr>
-          <w:i/>
-          <w:iCs/>
-        </w:rPr>
-        <w:t>Faltan unas 770 plazas</w:t>
+        <w:t xml:space="preserve">Titular: Faltan unas 776 plazas</w:t>
+      </w:r>
+      <w:r>
+        <w:rPr>
+          <w:i/>
+          <w:iCs/>
+        </w:rPr>
+        <w:t xml:space="preserve"/>
       </w:r>
     </w:p>
     <w:p>

</xml_diff>

<commit_message>
Historia: municipio al azar y pestaña de datos abiertos para mostrar la escala
Co-Authored-By: Claude Sonnet 5.5 <noreply@anthropic.com>
</commit_message>
<xml_diff>
--- a/docs/Speech.docx
+++ b/docs/Speech.docx
@@ -879,6 +879,50 @@
           <w:iCs/>
         </w:rPr>
         <w:t xml:space="preserve"> para enseñársela a mi marido."</w:t>
+      </w:r>
+    </w:p>
+    <w:p>
+      <w:pPr>
+        <w:numPr>
+          <w:ilvl w:val="0"/>
+          <w:numId w:val="1"/>
+        </w:numPr>
+      </w:pPr>
+      <w:r>
+        <w:rPr>
+          <w:b/>
+          <w:bCs/>
+        </w:rPr>
+        <w:t xml:space="preserve">Cualquier otro municipio</w:t>
+      </w:r>
+      <w:r>
+        <w:rPr>
+          <w:i/>
+          <w:iCs/>
+        </w:rPr>
+        <w:t xml:space="preserve"> (sin preparar; en ¿Dónde vivir? abrir uno cualquiera, por ejemplo Navalcarnero): "Y esto no es solo Getafe. Es lo mismo para los 179 municipios de la Comunidad, con datos oficiales y calculado automáticamente. Abro uno al azar… y tiene su ficha completa."</w:t>
+      </w:r>
+    </w:p>
+    <w:p>
+      <w:pPr>
+        <w:numPr>
+          <w:ilvl w:val="0"/>
+          <w:numId w:val="1"/>
+        </w:numPr>
+      </w:pPr>
+      <w:r>
+        <w:rPr>
+          <w:b/>
+          <w:bCs/>
+        </w:rPr>
+        <w:t xml:space="preserve">Pestaña Datos abiertos</w:t>
+      </w:r>
+      <w:r>
+        <w:rPr>
+          <w:i/>
+          <w:iCs/>
+        </w:rPr>
+        <w:t xml:space="preserve"> (arriba, un segundo): "Y todo lo que hemos elaborado está publicado y se puede descargar, con su diccionario."</w:t>
       </w:r>
     </w:p>
     <w:p>

</xml_diff>

<commit_message>
Bienvenida de 15 s antes del gancho de la historia
Co-Authored-By: Claude Sonnet 5.5 <noreply@anthropic.com>
</commit_message>
<xml_diff>
--- a/docs/Speech.docx
+++ b/docs/Speech.docx
@@ -7,6 +7,34 @@
         <w:t>LA HISTORIA (0:00 – 4:30)</w:t>
       </w:r>
     </w:p>
+    <w:p>
+      <w:pPr>
+        <w:rPr>
+          <w:b/>
+          <w:bCs/>
+        </w:rPr>
+      </w:pPr>
+      <w:r>
+        <w:rPr>
+          <w:b/>
+          <w:bCs/>
+        </w:rPr>
+        <w:t xml:space="preserve">0:00 – 0:15 · Bienvenida (Laura, con la portada en pantalla)</w:t>
+      </w:r>
+    </w:p>
+    <w:p>
+      <w:r>
+        <w:rPr>
+          <w:b/>
+          <w:bCs/>
+        </w:rPr>
+        <w:t xml:space="preserve">Laura:</w:t>
+      </w:r>
+      <w:r>
+        <w:t xml:space="preserve"> "Bienvenidos a Cuna y Canas. Buenos días. Cuna y Canas cuenta qué hace falta y qué viene en tu barrio, desde la cuna hasta las canas, con los datos abiertos de la Comunidad de Madrid. Y como los datos se entienden mejor con una persona detrás, os lo cuento con una historia: la mía."</w:t>
+      </w:r>
+    </w:p>
+    <w:p/>
     <w:p>
       <w:pPr>
         <w:rPr>

</xml_diff>

<commit_message>
Apertura con una sola frase antes del dibujo de Martina
Co-Authored-By: Claude Sonnet 5.5 <noreply@anthropic.com>
</commit_message>
<xml_diff>
--- a/docs/Speech.docx
+++ b/docs/Speech.docx
@@ -48,6 +48,11 @@
           <w:bCs/>
         </w:rPr>
         <w:t>0:00 – 0:30 · Gancho (Laura, con el dibujo en la mano)</w:t>
+      </w:r>
+    </w:p>
+    <w:p>
+      <w:r>
+        <w:t xml:space="preserve">"Bienvenidos a Cuna y Canas: los datos abiertos de Madrid, de la cuna a las canas, contados con una historia."</w:t>
       </w:r>
     </w:p>
     <w:p>

</xml_diff>

<commit_message>
Barrios: iconos del mapa estables y dónde podrían ir los centros nuevos del barrio
Co-Authored-By: Claude Sonnet 5.5 <noreply@anthropic.com>
</commit_message>
<xml_diff>
--- a/docs/Speech.docx
+++ b/docs/Speech.docx
@@ -2,39 +2,6 @@
 <file path=word/document.xml><?xml version="1.0" encoding="utf-8"?>
 <w:document xmlns:wpc="http://schemas.microsoft.com/office/word/2010/wordprocessingCanvas" xmlns:cx="http://schemas.microsoft.com/office/drawing/2014/chartex" xmlns:cx1="http://schemas.microsoft.com/office/drawing/2015/9/8/chartex" xmlns:cx2="http://schemas.microsoft.com/office/drawing/2015/10/21/chartex" xmlns:cx3="http://schemas.microsoft.com/office/drawing/2016/5/9/chartex" xmlns:cx4="http://schemas.microsoft.com/office/drawing/2016/5/10/chartex" xmlns:cx5="http://schemas.microsoft.com/office/drawing/2016/5/11/chartex" xmlns:cx6="http://schemas.microsoft.com/office/drawing/2016/5/12/chartex" xmlns:cx7="http://schemas.microsoft.com/office/drawing/2016/5/13/chartex" xmlns:cx8="http://schemas.microsoft.com/office/drawing/2016/5/14/chartex" xmlns:mc="http://schemas.openxmlformats.org/markup-compatibility/2006" xmlns:aink="http://schemas.microsoft.com/office/drawing/2016/ink" xmlns:am3d="http://schemas.microsoft.com/office/drawing/2017/model3d" xmlns:o="urn:schemas-microsoft-com:office:office" xmlns:oel="http://schemas.microsoft.com/office/2019/extlst" xmlns:r="http://schemas.openxmlformats.org/officeDocument/2006/relationships" xmlns:m="http://schemas.openxmlformats.org/officeDocument/2006/math" xmlns:v="urn:schemas-microsoft-com:vml" xmlns:wp14="http://schemas.microsoft.com/office/word/2010/wordprocessingDrawing" xmlns:wp="http://schemas.openxmlformats.org/drawingml/2006/wordprocessingDrawing" xmlns:w10="urn:schemas-microsoft-com:office:word" xmlns:w="http://schemas.openxmlformats.org/wordprocessingml/2006/main" xmlns:w14="http://schemas.microsoft.com/office/word/2010/wordml" xmlns:w15="http://schemas.microsoft.com/office/word/2012/wordml" xmlns:w16cex="http://schemas.microsoft.com/office/word/2018/wordml/cex" xmlns:w16cid="http://schemas.microsoft.com/office/word/2016/wordml/cid" xmlns:w16="http://schemas.microsoft.com/office/word/2018/wordml" xmlns:w16du="http://schemas.microsoft.com/office/word/2023/wordml/word16du" xmlns:w16sdtdh="http://schemas.microsoft.com/office/word/2020/wordml/sdtdatahash" xmlns:w16sdtfl="http://schemas.microsoft.com/office/word/2024/wordml/sdtformatlock" xmlns:w16se="http://schemas.microsoft.com/office/word/2015/wordml/symex" xmlns:wpg="http://schemas.microsoft.com/office/word/2010/wordprocessingGroup" xmlns:wpi="http://schemas.microsoft.com/office/word/2010/wordprocessingInk" xmlns:wne="http://schemas.microsoft.com/office/word/2006/wordml" xmlns:wps="http://schemas.microsoft.com/office/word/2010/wordprocessingShape" mc:Ignorable="w14 w15 w16se w16cid w16 w16cex w16sdtdh w16sdtfl w16du wp14">
   <w:body>
-    <w:p>
-      <w:r>
-        <w:t>LA HISTORIA (0:00 – 4:30)</w:t>
-      </w:r>
-    </w:p>
-    <w:p>
-      <w:pPr>
-        <w:rPr>
-          <w:b/>
-          <w:bCs/>
-        </w:rPr>
-      </w:pPr>
-      <w:r>
-        <w:rPr>
-          <w:b/>
-          <w:bCs/>
-        </w:rPr>
-        <w:t xml:space="preserve">0:00 – 0:15 · Bienvenida (Laura, con la portada en pantalla)</w:t>
-      </w:r>
-    </w:p>
-    <w:p>
-      <w:r>
-        <w:rPr>
-          <w:b/>
-          <w:bCs/>
-        </w:rPr>
-        <w:t xml:space="preserve">Laura:</w:t>
-      </w:r>
-      <w:r>
-        <w:t xml:space="preserve"> "Bienvenidos a Cuna y Canas. Buenos días. Cuna y Canas cuenta qué hace falta y qué viene en tu barrio, desde la cuna hasta las canas, con los datos abiertos de la Comunidad de Madrid. Y como los datos se entienden mejor con una persona detrás, os lo cuento con una historia: la mía."</w:t>
-      </w:r>
-    </w:p>
-    <w:p/>
     <w:p>
       <w:pPr>
         <w:rPr>

</xml_diff>

<commit_message>
Historia: Lo que viene más corto, sin plano ni extras
Co-Authored-By: Claude Sonnet 5.5 <noreply@anthropic.com>
</commit_message>
<xml_diff>
--- a/docs/Speech.docx
+++ b/docs/Speech.docx
@@ -696,18 +696,6 @@
       </w:r>
     </w:p>
     <w:p>
-      <w:r>
-        <w:rPr>
-          <w:b/>
-          <w:bCs/>
-        </w:rPr>
-        <w:t>Plano de solo lectura</w:t>
-      </w:r>
-      <w:r>
-        <w:t> (cualquier vecino lo ve, sin acceso de técnico):</w:t>
-      </w:r>
-    </w:p>
-    <w:p>
       <w:pPr>
         <w:numPr>
           <w:ilvl w:val="0"/>
@@ -719,210 +707,33 @@
           <w:b/>
           <w:bCs/>
         </w:rPr>
-        <w:t>Colegio:</w:t>
-      </w:r>
-      <w:r>
-        <w:t> </w:t>
+        <w:t>Ficha PDF</w:t>
+      </w:r>
+      <w:r>
+        <w:t> (un segundo): </w:t>
       </w:r>
       <w:r>
         <w:rPr>
           <w:i/>
           <w:iCs/>
         </w:rPr>
-        <w:t>"harían falta 3 nuevos, 2 ya hoy: Los Molinos y Buenavista."</w:t>
-      </w:r>
-    </w:p>
-    <w:p>
-      <w:pPr>
-        <w:numPr>
-          <w:ilvl w:val="0"/>
-          <w:numId w:val="1"/>
-        </w:numPr>
-      </w:pPr>
-      <w:r>
-        <w:rPr>
-          <w:b/>
-          <w:bCs/>
-        </w:rPr>
-        <w:t xml:space="preserve">Centro de día</w:t>
-      </w:r>
-      <w:r>
-        <w:t xml:space="preserve"> </w:t>
-      </w:r>
+        <w:t xml:space="preserve">"Me llevo </w:t>
+      </w:r>
+      <w:proofErr w:type="spellStart"/>
       <w:r>
         <w:rPr>
           <w:i/>
           <w:iCs/>
         </w:rPr>
-        <w:t xml:space="preserve">(aquí, despacio)</w:t>
-      </w:r>
-      <w:r>
-        <w:t xml:space="preserve">: </w:t>
-      </w:r>
+        <w:t>FichaGetafe</w:t>
+      </w:r>
+      <w:proofErr w:type="spellEnd"/>
       <w:r>
         <w:rPr>
           <w:i/>
           <w:iCs/>
         </w:rPr>
-        <w:t xml:space="preserve">"harían falta </w:t>
-      </w:r>
-      <w:r>
-        <w:rPr>
-          <w:b/>
-          <w:bCs/>
-          <w:i/>
-          <w:iCs/>
-        </w:rPr>
-        <w:t xml:space="preserve">4 nuevos, los cuatro ya hoy</w:t>
-      </w:r>
-      <w:r>
-        <w:rPr>
-          <w:i/>
-          <w:iCs/>
-        </w:rPr>
-        <w:t xml:space="preserve">: Juan de la Cierva, El Bercial, Greco y </w:t>
-      </w:r>
-      <w:proofErr w:type="spellStart"/>
-      <w:r>
-        <w:rPr>
-          <w:i/>
-          <w:iCs/>
-        </w:rPr>
-        <w:t xml:space="preserve">Kelvinator</w:t>
-      </w:r>
-      <w:proofErr w:type="spellEnd"/>
-      <w:r>
-        <w:rPr>
-          <w:i/>
-          <w:iCs/>
-        </w:rPr>
-        <w:t xml:space="preserve">. </w:t>
-      </w:r>
-      <w:r>
-        <w:rPr>
-          <w:b/>
-          <w:bCs/>
-          <w:i/>
-          <w:iCs/>
-        </w:rPr>
-        <w:t xml:space="preserve">¡Mi padre! Llegamos antes que él.</w:t>
-      </w:r>
-      <w:r>
-        <w:rPr>
-          <w:i/>
-          <w:iCs/>
-        </w:rPr>
-        <w:t xml:space="preserve">"</w:t>
-      </w:r>
-    </w:p>
-    <w:p>
-      <w:pPr>
-        <w:numPr>
-          <w:ilvl w:val="0"/>
-          <w:numId w:val="1"/>
-        </w:numPr>
-      </w:pPr>
-      <w:r>
-        <w:rPr>
-          <w:i/>
-          <w:iCs/>
-        </w:rPr>
-        <w:t>(si da tiempo)</w:t>
-      </w:r>
-      <w:r>
-        <w:t> Escuela infantil y centro de salud: </w:t>
-      </w:r>
-      <w:r>
-        <w:rPr>
-          <w:i/>
-          <w:iCs/>
-        </w:rPr>
-        <w:t>"no hacen falta nuevos."</w:t>
-      </w:r>
-    </w:p>
-    <w:p>
-      <w:pPr>
-        <w:numPr>
-          <w:ilvl w:val="0"/>
-          <w:numId w:val="1"/>
-        </w:numPr>
-      </w:pPr>
-      <w:r>
-        <w:rPr>
-          <w:b/>
-          <w:bCs/>
-        </w:rPr>
-        <w:t>Ficha PDF</w:t>
-      </w:r>
-      <w:r>
-        <w:t> (un segundo): </w:t>
-      </w:r>
-      <w:r>
-        <w:rPr>
-          <w:i/>
-          <w:iCs/>
-        </w:rPr>
-        <w:t xml:space="preserve">"Me llevo </w:t>
-      </w:r>
-      <w:proofErr w:type="spellStart"/>
-      <w:r>
-        <w:rPr>
-          <w:i/>
-          <w:iCs/>
-        </w:rPr>
-        <w:t>FichaGetafe</w:t>
-      </w:r>
-      <w:proofErr w:type="spellEnd"/>
-      <w:r>
-        <w:rPr>
-          <w:i/>
-          <w:iCs/>
-        </w:rPr>
         <w:t xml:space="preserve"> para enseñársela a mi marido."</w:t>
-      </w:r>
-    </w:p>
-    <w:p>
-      <w:pPr>
-        <w:numPr>
-          <w:ilvl w:val="0"/>
-          <w:numId w:val="1"/>
-        </w:numPr>
-      </w:pPr>
-      <w:r>
-        <w:rPr>
-          <w:b/>
-          <w:bCs/>
-        </w:rPr>
-        <w:t xml:space="preserve">Cualquier otro municipio</w:t>
-      </w:r>
-      <w:r>
-        <w:rPr>
-          <w:i/>
-          <w:iCs/>
-        </w:rPr>
-        <w:t xml:space="preserve"> (sin preparar; en ¿Dónde vivir? abrir uno cualquiera, por ejemplo Navalcarnero): "Y esto no es solo Getafe. Es lo mismo para los 179 municipios de la Comunidad, con datos oficiales y calculado automáticamente. Abro uno al azar… y tiene su ficha completa."</w:t>
-      </w:r>
-    </w:p>
-    <w:p>
-      <w:pPr>
-        <w:numPr>
-          <w:ilvl w:val="0"/>
-          <w:numId w:val="1"/>
-        </w:numPr>
-      </w:pPr>
-      <w:r>
-        <w:rPr>
-          <w:b/>
-          <w:bCs/>
-        </w:rPr>
-        <w:t xml:space="preserve">Pestaña Datos abiertos</w:t>
-      </w:r>
-      <w:r>
-        <w:rPr>
-          <w:i/>
-          <w:iCs/>
-        </w:rPr>
-        <w:t xml:space="preserve"> (arriba, un segundo): "Y todo lo que hemos elaborado está publicado y se puede descargar, con su diccionario."</w:t>
       </w:r>
     </w:p>
     <w:p>

</xml_diff>